<commit_message>
Added a bunch of stuff...
Ignore the file_management.py file... 👀
</commit_message>
<xml_diff>
--- a/class documents/syllabus.docx
+++ b/class documents/syllabus.docx
@@ -8,6 +8,7 @@
         <w:rPr>
           <w:rFonts w:ascii="Montserrat" w:cs="Montserrat" w:eastAsia="Montserrat" w:hAnsi="Montserrat"/>
           <w:b w:val="1"/>
+          <w:bCs w:val="1"/>
           <w:sz w:val="48"/>
           <w:szCs w:val="48"/>
         </w:rPr>
@@ -16,6 +17,7 @@
         <w:rPr>
           <w:rFonts w:ascii="Montserrat" w:cs="Montserrat" w:eastAsia="Montserrat" w:hAnsi="Montserrat"/>
           <w:b w:val="1"/>
+          <w:bCs w:val="1"/>
           <w:sz w:val="48"/>
           <w:szCs w:val="48"/>
           <w:rtl w:val="0"/>
@@ -34,6 +36,7 @@
         <w:rPr>
           <w:rFonts w:ascii="Montserrat" w:cs="Montserrat" w:eastAsia="Montserrat" w:hAnsi="Montserrat"/>
           <w:b w:val="1"/>
+          <w:bCs w:val="1"/>
           <w:sz w:val="24"/>
           <w:szCs w:val="24"/>
         </w:rPr>
@@ -56,6 +59,7 @@
         <w:rPr>
           <w:rFonts w:ascii="Montserrat" w:cs="Montserrat" w:eastAsia="Montserrat" w:hAnsi="Montserrat"/>
           <w:b w:val="1"/>
+          <w:bCs w:val="1"/>
           <w:color w:val="0000ff"/>
           <w:sz w:val="24"/>
           <w:szCs w:val="24"/>
@@ -89,6 +93,7 @@
         <w:rPr>
           <w:rFonts w:ascii="Montserrat" w:cs="Montserrat" w:eastAsia="Montserrat" w:hAnsi="Montserrat"/>
           <w:b w:val="1"/>
+          <w:bCs w:val="1"/>
           <w:color w:val="0000ff"/>
           <w:sz w:val="24"/>
           <w:szCs w:val="24"/>
@@ -114,6 +119,7 @@
         <w:rPr>
           <w:rFonts w:ascii="Montserrat" w:cs="Montserrat" w:eastAsia="Montserrat" w:hAnsi="Montserrat"/>
           <w:b w:val="1"/>
+          <w:bCs w:val="1"/>
           <w:color w:val="0000ff"/>
           <w:sz w:val="24"/>
           <w:szCs w:val="24"/>
@@ -139,7 +145,7 @@
           <w:szCs w:val="24"/>
           <w:rtl w:val="0"/>
         </w:rPr>
-        <w:t xml:space="preserve">Martes y Jueves</w:t>
+        <w:t xml:space="preserve">{Day1} y {Day2}</w:t>
       </w:r>
       <w:r>
         <w:rPr>
@@ -152,6 +158,7 @@
         <w:rPr>
           <w:rFonts w:ascii="Montserrat" w:cs="Montserrat" w:eastAsia="Montserrat" w:hAnsi="Montserrat"/>
           <w:b w:val="1"/>
+          <w:bCs w:val="1"/>
           <w:color w:val="0000ff"/>
           <w:sz w:val="24"/>
           <w:szCs w:val="24"/>
@@ -176,6 +183,7 @@
         <w:rPr>
           <w:rFonts w:ascii="Montserrat" w:cs="Montserrat" w:eastAsia="Montserrat" w:hAnsi="Montserrat"/>
           <w:b w:val="1"/>
+          <w:bCs w:val="1"/>
           <w:color w:val="0000ff"/>
           <w:sz w:val="24"/>
           <w:szCs w:val="24"/>
@@ -205,6 +213,7 @@
         <w:rPr>
           <w:rFonts w:ascii="Montserrat" w:cs="Montserrat" w:eastAsia="Montserrat" w:hAnsi="Montserrat"/>
           <w:b w:val="1"/>
+          <w:bCs w:val="1"/>
           <w:color w:val="0000ff"/>
           <w:sz w:val="24"/>
           <w:szCs w:val="24"/>
@@ -230,6 +239,7 @@
         <w:rPr>
           <w:rFonts w:ascii="Montserrat" w:cs="Montserrat" w:eastAsia="Montserrat" w:hAnsi="Montserrat"/>
           <w:b w:val="1"/>
+          <w:bCs w:val="1"/>
           <w:color w:val="0000ff"/>
           <w:sz w:val="24"/>
           <w:szCs w:val="24"/>
@@ -261,6 +271,7 @@
         <w:rPr>
           <w:rFonts w:ascii="Montserrat" w:cs="Montserrat" w:eastAsia="Montserrat" w:hAnsi="Montserrat"/>
           <w:b w:val="1"/>
+          <w:bCs w:val="1"/>
           <w:color w:val="0000ff"/>
           <w:sz w:val="24"/>
           <w:szCs w:val="24"/>
@@ -308,6 +319,7 @@
         <w:rPr>
           <w:rFonts w:ascii="Montserrat" w:cs="Montserrat" w:eastAsia="Montserrat" w:hAnsi="Montserrat"/>
           <w:b w:val="1"/>
+          <w:bCs w:val="1"/>
           <w:color w:val="0000ff"/>
           <w:sz w:val="24"/>
           <w:szCs w:val="24"/>
@@ -485,6 +497,7 @@
               <w:rPr>
                 <w:rFonts w:ascii="Verdana" w:cs="Verdana" w:eastAsia="Verdana" w:hAnsi="Verdana"/>
                 <w:b w:val="1"/>
+                <w:bCs w:val="1"/>
                 <w:color w:val="ffffff"/>
                 <w:sz w:val="18"/>
                 <w:szCs w:val="18"/>
@@ -528,6 +541,7 @@
               <w:rPr>
                 <w:rFonts w:ascii="Verdana" w:cs="Verdana" w:eastAsia="Verdana" w:hAnsi="Verdana"/>
                 <w:b w:val="1"/>
+                <w:bCs w:val="1"/>
                 <w:color w:val="ffffff"/>
                 <w:sz w:val="18"/>
                 <w:szCs w:val="18"/>
@@ -571,6 +585,7 @@
               <w:rPr>
                 <w:rFonts w:ascii="Verdana" w:cs="Verdana" w:eastAsia="Verdana" w:hAnsi="Verdana"/>
                 <w:b w:val="1"/>
+                <w:bCs w:val="1"/>
                 <w:color w:val="ffffff"/>
                 <w:sz w:val="18"/>
                 <w:szCs w:val="18"/>
@@ -614,6 +629,7 @@
               <w:rPr>
                 <w:rFonts w:ascii="Verdana" w:cs="Verdana" w:eastAsia="Verdana" w:hAnsi="Verdana"/>
                 <w:b w:val="1"/>
+                <w:bCs w:val="1"/>
                 <w:color w:val="ffffff"/>
                 <w:sz w:val="18"/>
                 <w:szCs w:val="18"/>
@@ -657,6 +673,7 @@
               <w:rPr>
                 <w:rFonts w:ascii="Verdana" w:cs="Verdana" w:eastAsia="Verdana" w:hAnsi="Verdana"/>
                 <w:b w:val="1"/>
+                <w:bCs w:val="1"/>
                 <w:color w:val="ffffff"/>
                 <w:sz w:val="18"/>
                 <w:szCs w:val="18"/>
@@ -700,6 +717,7 @@
               <w:rPr>
                 <w:rFonts w:ascii="Verdana" w:cs="Verdana" w:eastAsia="Verdana" w:hAnsi="Verdana"/>
                 <w:b w:val="1"/>
+                <w:bCs w:val="1"/>
                 <w:color w:val="ffffff"/>
                 <w:sz w:val="18"/>
                 <w:szCs w:val="18"/>
@@ -787,7 +805,7 @@
                 <w:szCs w:val="18"/>
                 <w:rtl w:val="0"/>
               </w:rPr>
-              <w:t xml:space="preserve">Martes y Jueves 11:00am - 1:00pm</w:t>
+              <w:t xml:space="preserve">{Day1} y {Day2} 11:00am - 1:00pm</w:t>
             </w:r>
           </w:p>
         </w:tc>
@@ -2729,6 +2747,7 @@
     </w:pPr>
     <w:rPr>
       <w:b w:val="0"/>
+      <w:bCs w:val="0"/>
       <w:sz w:val="32"/>
       <w:szCs w:val="32"/>
     </w:rPr>
@@ -2745,6 +2764,7 @@
     </w:pPr>
     <w:rPr>
       <w:b w:val="0"/>
+      <w:bCs w:val="0"/>
       <w:color w:val="434343"/>
       <w:sz w:val="28"/>
       <w:szCs w:val="28"/>
@@ -2794,6 +2814,7 @@
     </w:pPr>
     <w:rPr>
       <w:i w:val="1"/>
+      <w:iCs w:val="1"/>
       <w:color w:val="666666"/>
       <w:sz w:val="22"/>
       <w:szCs w:val="22"/>
@@ -2827,6 +2848,7 @@
     <w:rPr>
       <w:rFonts w:ascii="Arial" w:cs="Arial" w:eastAsia="Arial" w:hAnsi="Arial"/>
       <w:i w:val="0"/>
+      <w:iCs w:val="0"/>
       <w:color w:val="666666"/>
       <w:sz w:val="30"/>
       <w:szCs w:val="30"/>

</xml_diff>